<commit_message>
29 - Added Documentation for OCRWorker; Updated Documentation for Sprint3
</commit_message>
<xml_diff>
--- a/documentation/Sprint3.docx
+++ b/documentation/Sprint3.docx
@@ -300,21 +300,8 @@
         </w:numPr>
       </w:pPr>
       <w:r>
-        <w:t xml:space="preserve">The OCR worker consumes messages from the input queue. In later sprints, it will use the message’s information to fetch the file associated with the id provided via the message from the </w:t>
-      </w:r>
-      <w:proofErr w:type="spellStart"/>
-      <w:r>
-        <w:t>MinIO</w:t>
-      </w:r>
-      <w:proofErr w:type="spellEnd"/>
-      <w:r>
-        <w:t xml:space="preserve"> file </w:t>
-      </w:r>
-      <w:proofErr w:type="spellStart"/>
-      <w:r>
-        <w:t>storarge</w:t>
-      </w:r>
-      <w:proofErr w:type="spellEnd"/>
+        <w:t>The OCR worker consumes messages from the input queue. In later sprints, it will use the message’s information to fetch the file associated with the id provided via the message from the MinIO file storarge</w:t>
+      </w:r>
     </w:p>
     <w:p>
       <w:pPr>
@@ -401,31 +388,7 @@
         </w:numPr>
       </w:pPr>
       <w:r>
-        <w:t>Log4net loggers were now also added to all services (</w:t>
-      </w:r>
-      <w:proofErr w:type="spellStart"/>
-      <w:r>
-        <w:t>DocumentService</w:t>
-      </w:r>
-      <w:proofErr w:type="spellEnd"/>
-      <w:r>
-        <w:t xml:space="preserve">, </w:t>
-      </w:r>
-      <w:proofErr w:type="spellStart"/>
-      <w:r>
-        <w:t>RabbitProducerService</w:t>
-      </w:r>
-      <w:proofErr w:type="spellEnd"/>
-      <w:r>
-        <w:t xml:space="preserve">, and </w:t>
-      </w:r>
-      <w:proofErr w:type="spellStart"/>
-      <w:r>
-        <w:t>RabbitConsumerService</w:t>
-      </w:r>
-      <w:proofErr w:type="spellEnd"/>
-      <w:r>
-        <w:t>) to track their behavior</w:t>
+        <w:t>Log4net loggers were now also added to all services (DocumentService, RabbitProducerService, and RabbitConsumerService) to track their behavior</w:t>
       </w:r>
     </w:p>
     <w:p>
@@ -436,13 +399,8 @@
           <w:numId w:val="11"/>
         </w:numPr>
       </w:pPr>
-      <w:proofErr w:type="spellStart"/>
-      <w:r>
-        <w:t>RabbitConsumerService</w:t>
-      </w:r>
-      <w:proofErr w:type="spellEnd"/>
-      <w:r>
-        <w:t xml:space="preserve"> features connection retry logic, with each failed connection attempt being logged </w:t>
+      <w:r>
+        <w:t xml:space="preserve">RabbitConsumerService features connection retry logic, with each failed connection attempt being logged </w:t>
       </w:r>
     </w:p>
     <w:p/>
@@ -498,11 +456,9 @@
           <w:numId w:val="2"/>
         </w:numPr>
       </w:pPr>
-      <w:proofErr w:type="spellStart"/>
       <w:r>
         <w:t>Presenation</w:t>
       </w:r>
-      <w:proofErr w:type="spellEnd"/>
       <w:r>
         <w:t xml:space="preserve"> layer: Vue</w:t>
       </w:r>
@@ -545,11 +501,7 @@
         </w:numPr>
       </w:pPr>
       <w:r>
-        <w:t xml:space="preserve">API layer: </w:t>
-      </w:r>
-      <w:proofErr w:type="spellStart"/>
-      <w:r>
-        <w:t>Document</w:t>
+        <w:t>API layer: Document</w:t>
       </w:r>
       <w:r>
         <w:t>s</w:t>
@@ -557,7 +509,6 @@
       <w:r>
         <w:t>Controller</w:t>
       </w:r>
-      <w:proofErr w:type="spellEnd"/>
     </w:p>
     <w:p>
       <w:pPr>
@@ -568,29 +519,11 @@
         </w:numPr>
       </w:pPr>
       <w:r>
-        <w:t xml:space="preserve">Business layer: </w:t>
-      </w:r>
-      <w:proofErr w:type="spellStart"/>
-      <w:r>
-        <w:t>DocumentService</w:t>
-      </w:r>
-      <w:proofErr w:type="spellEnd"/>
-      <w:r>
-        <w:t xml:space="preserve">, </w:t>
-      </w:r>
-      <w:proofErr w:type="spellStart"/>
-      <w:r>
-        <w:t>RabbitProducerService</w:t>
-      </w:r>
-      <w:proofErr w:type="spellEnd"/>
-      <w:r>
-        <w:t xml:space="preserve">, </w:t>
-      </w:r>
-      <w:proofErr w:type="spellStart"/>
-      <w:r>
-        <w:t>RabbitConsumerService</w:t>
-      </w:r>
-      <w:proofErr w:type="spellEnd"/>
+        <w:t>Business layer: DocumentService</w:t>
+      </w:r>
+      <w:r>
+        <w:t>, RabbitProducerService, RabbitConsumerService</w:t>
+      </w:r>
     </w:p>
     <w:p>
       <w:pPr>
@@ -603,11 +536,9 @@
       <w:r>
         <w:t xml:space="preserve">Data access layer: </w:t>
       </w:r>
-      <w:proofErr w:type="spellStart"/>
       <w:r>
         <w:t>DocumentRepository</w:t>
       </w:r>
-      <w:proofErr w:type="spellEnd"/>
     </w:p>
     <w:p/>
     <w:p>
@@ -620,27 +551,14 @@
       </w:r>
     </w:p>
     <w:p>
-      <w:pPr>
-        <w:pStyle w:val="ListParagraph"/>
-        <w:numPr>
-          <w:ilvl w:val="0"/>
-          <w:numId w:val="12"/>
-        </w:numPr>
-      </w:pPr>
-      <w:r>
-        <w:t>API layer:</w:t>
-      </w:r>
-    </w:p>
-    <w:p>
-      <w:pPr>
-        <w:pStyle w:val="ListParagraph"/>
-        <w:numPr>
-          <w:ilvl w:val="0"/>
-          <w:numId w:val="12"/>
-        </w:numPr>
-      </w:pPr>
-      <w:r>
-        <w:t>Business layer:</w:t>
+      <w:r>
+        <w:t>See documentation/OCR</w:t>
+      </w:r>
+      <w:r>
+        <w:t>Worker</w:t>
+      </w:r>
+      <w:r>
+        <w:t>.pdf for detailed description</w:t>
       </w:r>
     </w:p>
     <w:p/>
@@ -668,13 +586,8 @@
         </w:numPr>
       </w:pPr>
       <w:r>
-        <w:t>Database: PostgreSQL container from docker-</w:t>
-      </w:r>
-      <w:proofErr w:type="spellStart"/>
-      <w:r>
-        <w:t>compose.yml</w:t>
-      </w:r>
-      <w:proofErr w:type="spellEnd"/>
+        <w:t>Database: PostgreSQL container from docker-compose.yml</w:t>
+      </w:r>
     </w:p>
     <w:p>
       <w:r>
@@ -701,13 +614,8 @@
       <w:r>
         <w:t xml:space="preserve">Unit tests implemented in project </w:t>
       </w:r>
-      <w:proofErr w:type="spellStart"/>
-      <w:r>
-        <w:t>Paperless.UnitTests</w:t>
-      </w:r>
-      <w:proofErr w:type="spellEnd"/>
-      <w:r>
-        <w:t>:</w:t>
+      <w:r>
+        <w:t>Paperless.UnitTests:</w:t>
       </w:r>
     </w:p>
     <w:p>
@@ -718,11 +626,9 @@
           <w:numId w:val="5"/>
         </w:numPr>
       </w:pPr>
-      <w:proofErr w:type="spellStart"/>
       <w:r>
         <w:t>DocumentsControllerTests</w:t>
       </w:r>
-      <w:proofErr w:type="spellEnd"/>
     </w:p>
     <w:p>
       <w:pPr>
@@ -732,12 +638,9 @@
           <w:numId w:val="5"/>
         </w:numPr>
       </w:pPr>
-      <w:proofErr w:type="spellStart"/>
-      <w:r>
-        <w:lastRenderedPageBreak/>
+      <w:r>
         <w:t>DocumentServiceTests</w:t>
       </w:r>
-      <w:proofErr w:type="spellEnd"/>
     </w:p>
     <w:p>
       <w:pPr>
@@ -747,26 +650,17 @@
           <w:numId w:val="5"/>
         </w:numPr>
       </w:pPr>
-      <w:proofErr w:type="spellStart"/>
-      <w:r>
+      <w:r>
+        <w:lastRenderedPageBreak/>
         <w:t>DocumentServiceValidationTests</w:t>
       </w:r>
-      <w:proofErr w:type="spellEnd"/>
     </w:p>
     <w:p>
       <w:r>
         <w:t>Database</w:t>
       </w:r>
       <w:r>
-        <w:t xml:space="preserve">, </w:t>
-      </w:r>
-      <w:proofErr w:type="spellStart"/>
-      <w:r>
-        <w:t>repositores</w:t>
-      </w:r>
-      <w:proofErr w:type="spellEnd"/>
-      <w:r>
-        <w:t>, validators, mappers</w:t>
+        <w:t>, repositores, validators, mappers</w:t>
       </w:r>
       <w:r>
         <w:t>, producers</w:t>
@@ -775,13 +669,8 @@
         <w:t xml:space="preserve"> and services</w:t>
       </w:r>
       <w:r>
-        <w:t xml:space="preserve"> mocked using </w:t>
-      </w:r>
-      <w:proofErr w:type="spellStart"/>
-      <w:r>
-        <w:t>Moq</w:t>
-      </w:r>
-      <w:proofErr w:type="spellEnd"/>
+        <w:t xml:space="preserve"> mocked using Moq</w:t>
+      </w:r>
       <w:r>
         <w:t>, each where required</w:t>
       </w:r>
@@ -811,13 +700,8 @@
       </w:r>
     </w:p>
     <w:p>
-      <w:proofErr w:type="spellStart"/>
-      <w:r>
-        <w:t>RabbitConsumerService</w:t>
-      </w:r>
-      <w:proofErr w:type="spellEnd"/>
-      <w:r>
-        <w:t xml:space="preserve"> would cause exceptions </w:t>
+      <w:r>
+        <w:t xml:space="preserve">RabbitConsumerService would cause exceptions </w:t>
       </w:r>
       <w:r>
         <w:t>during startup of the REST server which after a few retries of starting the server would resolve on their own. This was due to RabbitMQ not yet being ready to handle the service’s connection attempts despite the Docker service container having started successfully. After this successful start, RabbitMQ still needed a few seconds to be ready for accepting connections. Thus, connection retry logic was added to the service, with a maximum of ten attempts being allowed. This way, the service would only throw an exception if all ten attempts of connecting to RabbitMQ had failed, which resolved the issue.</w:t>
@@ -960,15 +844,7 @@
               <w:t xml:space="preserve">CI/CD pipeline, </w:t>
             </w:r>
             <w:r>
-              <w:t xml:space="preserve">docker compose </w:t>
-            </w:r>
-            <w:proofErr w:type="spellStart"/>
-            <w:r>
-              <w:t>yaml</w:t>
-            </w:r>
-            <w:proofErr w:type="spellEnd"/>
-            <w:r>
-              <w:t xml:space="preserve">, </w:t>
+              <w:t xml:space="preserve">docker compose yaml, </w:t>
             </w:r>
             <w:r>
               <w:t>Queues in REST server, Logging/Exception handling</w:t>
@@ -1016,13 +892,8 @@
           </w:tcPr>
           <w:p>
             <w:r>
-              <w:t xml:space="preserve">CI/CD pipeline, docker compose </w:t>
+              <w:t>CI/CD pipeline, docker compose yaml</w:t>
             </w:r>
-            <w:proofErr w:type="spellStart"/>
-            <w:r>
-              <w:t>yaml</w:t>
-            </w:r>
-            <w:proofErr w:type="spellEnd"/>
             <w:r>
               <w:t xml:space="preserve">, </w:t>
             </w:r>

</xml_diff>